<commit_message>
Aligned login with backend
</commit_message>
<xml_diff>
--- a/shared documentation/AUTH_API_CONTRACTS.docx
+++ b/shared documentation/AUTH_API_CONTRACTS.docx
@@ -15,7 +15,7 @@
     </w:p>
     <w:p>
       <w:r>
-        <w:t>Contratto delle API di autenticazione (aggiornato al 12/10/2026: nuovo campo user.isElectronicReceiptAccepted). Dati degli esempi inventati.</w:t>
+        <w:t>Contratto delle API di autenticazione, allineato al backend (aggiornato al 14/10/2026: rotte /api/identity/auth/login, refresh e logout; app = "hub" nel corpo del login; user = { id, email, role, propertyId }; cookie sb_rt con Path /api/identity). Dati degli esempi inventati.</w:t>
       </w:r>
     </w:p>
     <w:p>
@@ -44,7 +44,7 @@
           <w:b w:val="0"/>
           <w:color w:val="233C7D"/>
         </w:rPr>
-        <w:t>/api/auth/signin</w:t>
+        <w:t>/api/identity/auth/login</w:t>
       </w:r>
     </w:p>
     <w:p>
@@ -119,7 +119,23 @@
           <w:color w:val="233C7D"/>
           <w:sz w:val="19"/>
         </w:rPr>
-        <w:t xml:space="preserve">  "remember": true</w:t>
+        <w:t xml:space="preserve">  "remember": true,</w:t>
+      </w:r>
+    </w:p>
+    <w:p>
+      <w:pPr>
+        <w:keepNext/>
+        <w:spacing w:after="0"/>
+        <w:shd w:val="clear" w:color="auto" w:fill="F1F3F8"/>
+      </w:pPr>
+      <w:r>
+        <w:rPr>
+          <w:rFonts w:ascii="Consolas" w:hAnsi="Consolas"/>
+          <w:b w:val="0"/>
+          <w:color w:val="233C7D"/>
+          <w:sz w:val="19"/>
+        </w:rPr>
+        <w:t xml:space="preserve">  "app": "hub"</w:t>
       </w:r>
     </w:p>
     <w:p>
@@ -287,7 +303,7 @@
                 <w:b w:val="0"/>
                 <w:sz w:val="19"/>
               </w:rPr>
-              <w:t>Email dell'utente (senza spazi ai lati).</w:t>
+              <w:t>Email o nome utente (senza spazi ai lati).</w:t>
             </w:r>
           </w:p>
         </w:tc>
@@ -415,6 +431,69 @@
           </w:p>
         </w:tc>
       </w:tr>
+      <w:tr>
+        <w:trPr>
+          <w:cantSplit w:val="true"/>
+        </w:trPr>
+        <w:tc>
+          <w:tcPr>
+            <w:tcW w:type="dxa" w:w="2381"/>
+            <w:shd w:val="clear" w:color="auto" w:fill="F1F3F8"/>
+          </w:tcPr>
+          <w:p>
+            <w:pPr>
+              <w:spacing w:after="0"/>
+            </w:pPr>
+            <w:r>
+              <w:rPr>
+                <w:rFonts w:ascii="Consolas" w:hAnsi="Consolas"/>
+                <w:b w:val="0"/>
+                <w:color w:val="233C7D"/>
+                <w:sz w:val="19"/>
+              </w:rPr>
+              <w:t>app</w:t>
+            </w:r>
+          </w:p>
+        </w:tc>
+        <w:tc>
+          <w:tcPr>
+            <w:tcW w:type="dxa" w:w="2608"/>
+            <w:shd w:val="clear" w:color="auto" w:fill="F1F3F8"/>
+          </w:tcPr>
+          <w:p>
+            <w:pPr>
+              <w:spacing w:after="0"/>
+            </w:pPr>
+            <w:r>
+              <w:rPr>
+                <w:rFonts w:ascii="Consolas" w:hAnsi="Consolas"/>
+                <w:b w:val="0"/>
+                <w:color w:val="233C7D"/>
+                <w:sz w:val="19"/>
+              </w:rPr>
+              <w:t>string</w:t>
+            </w:r>
+          </w:p>
+        </w:tc>
+        <w:tc>
+          <w:tcPr>
+            <w:tcW w:type="dxa" w:w="4876"/>
+            <w:shd w:val="clear" w:color="auto" w:fill="F1F3F8"/>
+          </w:tcPr>
+          <w:p>
+            <w:pPr>
+              <w:spacing w:after="0"/>
+            </w:pPr>
+            <w:r>
+              <w:rPr>
+                <w:b w:val="0"/>
+                <w:sz w:val="19"/>
+              </w:rPr>
+              <w:t>Applicazione da cui si accede: "hub" per il gestionale (il backend accetta solo i ruoli dello staff). Per ora è fisso nel frontend (environment.authApp).</w:t>
+            </w:r>
+          </w:p>
+        </w:tc>
+      </w:tr>
     </w:tbl>
     <w:p>
       <w:pPr>
@@ -491,7 +570,7 @@
           <w:color w:val="233C7D"/>
           <w:sz w:val="19"/>
         </w:rPr>
-        <w:t xml:space="preserve">  "expiresIn": 900,</w:t>
+        <w:t xml:space="preserve">  "expiresIn": 604800,</w:t>
       </w:r>
     </w:p>
     <w:p>
@@ -523,6 +602,22 @@
           <w:color w:val="233C7D"/>
           <w:sz w:val="19"/>
         </w:rPr>
+        <w:t xml:space="preserve">    "id": "0f3c2a1b-7d6e-4f5a-9b8c-1d2e3f4a5b6c",</w:t>
+      </w:r>
+    </w:p>
+    <w:p>
+      <w:pPr>
+        <w:keepNext/>
+        <w:spacing w:after="0"/>
+        <w:shd w:val="clear" w:color="auto" w:fill="F1F3F8"/>
+      </w:pPr>
+      <w:r>
+        <w:rPr>
+          <w:rFonts w:ascii="Consolas" w:hAnsi="Consolas"/>
+          <w:b w:val="0"/>
+          <w:color w:val="233C7D"/>
+          <w:sz w:val="19"/>
+        </w:rPr>
         <w:t xml:space="preserve">    "email": "mario.rossi@example.com",</w:t>
       </w:r>
     </w:p>
@@ -539,7 +634,7 @@
           <w:color w:val="233C7D"/>
           <w:sz w:val="19"/>
         </w:rPr>
-        <w:t xml:space="preserve">    "idProperty": "5b1f3c7e-2d4a-4e8b-9c1d-7a6e5f4b3c2d",</w:t>
+        <w:t xml:space="preserve">    "role": "manager",</w:t>
       </w:r>
     </w:p>
     <w:p>
@@ -555,55 +650,7 @@
           <w:color w:val="233C7D"/>
           <w:sz w:val="19"/>
         </w:rPr>
-        <w:t xml:space="preserve">    "roles": [</w:t>
-      </w:r>
-    </w:p>
-    <w:p>
-      <w:pPr>
-        <w:keepNext/>
-        <w:spacing w:after="0"/>
-        <w:shd w:val="clear" w:color="auto" w:fill="F1F3F8"/>
-      </w:pPr>
-      <w:r>
-        <w:rPr>
-          <w:rFonts w:ascii="Consolas" w:hAnsi="Consolas"/>
-          <w:b w:val="0"/>
-          <w:color w:val="233C7D"/>
-          <w:sz w:val="19"/>
-        </w:rPr>
-        <w:t xml:space="preserve">      "Manager"</w:t>
-      </w:r>
-    </w:p>
-    <w:p>
-      <w:pPr>
-        <w:keepNext/>
-        <w:spacing w:after="0"/>
-        <w:shd w:val="clear" w:color="auto" w:fill="F1F3F8"/>
-      </w:pPr>
-      <w:r>
-        <w:rPr>
-          <w:rFonts w:ascii="Consolas" w:hAnsi="Consolas"/>
-          <w:b w:val="0"/>
-          <w:color w:val="233C7D"/>
-          <w:sz w:val="19"/>
-        </w:rPr>
-        <w:t xml:space="preserve">    ],</w:t>
-      </w:r>
-    </w:p>
-    <w:p>
-      <w:pPr>
-        <w:keepNext/>
-        <w:spacing w:after="0"/>
-        <w:shd w:val="clear" w:color="auto" w:fill="F1F3F8"/>
-      </w:pPr>
-      <w:r>
-        <w:rPr>
-          <w:rFonts w:ascii="Consolas" w:hAnsi="Consolas"/>
-          <w:b w:val="0"/>
-          <w:color w:val="233C7D"/>
-          <w:sz w:val="19"/>
-        </w:rPr>
-        <w:t xml:space="preserve">    "isElectronicReceiptAccepted": false</w:t>
+        <w:t xml:space="preserve">    "propertyId": "5b1f3c7e-2d4a-4e8b-9c1d-7a6e5f4b3c2d"</w:t>
       </w:r>
     </w:p>
     <w:p>
@@ -935,7 +982,130 @@
                 <w:color w:val="233C7D"/>
                 <w:sz w:val="19"/>
               </w:rPr>
+              <w:t>user.id</w:t>
+            </w:r>
+          </w:p>
+        </w:tc>
+        <w:tc>
+          <w:tcPr>
+            <w:tcW w:type="dxa" w:w="2608"/>
+            <w:shd w:val="clear" w:color="auto" w:fill="F1F3F8"/>
+          </w:tcPr>
+          <w:p>
+            <w:pPr>
+              <w:spacing w:after="0"/>
+            </w:pPr>
+            <w:r>
+              <w:rPr>
+                <w:rFonts w:ascii="Consolas" w:hAnsi="Consolas"/>
+                <w:b w:val="0"/>
+                <w:color w:val="233C7D"/>
+                <w:sz w:val="19"/>
+              </w:rPr>
+              <w:t>string (UUID)</w:t>
+            </w:r>
+          </w:p>
+        </w:tc>
+        <w:tc>
+          <w:tcPr>
+            <w:tcW w:type="dxa" w:w="4876"/>
+            <w:shd w:val="clear" w:color="auto" w:fill="F1F3F8"/>
+          </w:tcPr>
+          <w:p>
+            <w:pPr>
+              <w:spacing w:after="0"/>
+            </w:pPr>
+            <w:r>
+              <w:rPr>
+                <w:b w:val="0"/>
+                <w:sz w:val="19"/>
+              </w:rPr>
+              <w:t>Id dell'utente.</w:t>
+            </w:r>
+          </w:p>
+        </w:tc>
+      </w:tr>
+      <w:tr>
+        <w:trPr>
+          <w:cantSplit w:val="true"/>
+        </w:trPr>
+        <w:tc>
+          <w:tcPr>
+            <w:tcW w:type="dxa" w:w="2381"/>
+          </w:tcPr>
+          <w:p>
+            <w:pPr>
+              <w:spacing w:after="0"/>
+            </w:pPr>
+            <w:r>
+              <w:rPr>
+                <w:rFonts w:ascii="Consolas" w:hAnsi="Consolas"/>
+                <w:b w:val="0"/>
+                <w:color w:val="233C7D"/>
+                <w:sz w:val="19"/>
+              </w:rPr>
               <w:t>user.email</w:t>
+            </w:r>
+          </w:p>
+        </w:tc>
+        <w:tc>
+          <w:tcPr>
+            <w:tcW w:type="dxa" w:w="2608"/>
+          </w:tcPr>
+          <w:p>
+            <w:pPr>
+              <w:spacing w:after="0"/>
+            </w:pPr>
+            <w:r>
+              <w:rPr>
+                <w:rFonts w:ascii="Consolas" w:hAnsi="Consolas"/>
+                <w:b w:val="0"/>
+                <w:color w:val="233C7D"/>
+                <w:sz w:val="19"/>
+              </w:rPr>
+              <w:t>string</w:t>
+            </w:r>
+          </w:p>
+        </w:tc>
+        <w:tc>
+          <w:tcPr>
+            <w:tcW w:type="dxa" w:w="4876"/>
+          </w:tcPr>
+          <w:p>
+            <w:pPr>
+              <w:spacing w:after="0"/>
+            </w:pPr>
+            <w:r>
+              <w:rPr>
+                <w:b w:val="0"/>
+                <w:sz w:val="19"/>
+              </w:rPr>
+              <w:t>Email dell'utente (l'header mostra la sua iniziale).</w:t>
+            </w:r>
+          </w:p>
+        </w:tc>
+      </w:tr>
+      <w:tr>
+        <w:trPr>
+          <w:cantSplit w:val="true"/>
+        </w:trPr>
+        <w:tc>
+          <w:tcPr>
+            <w:tcW w:type="dxa" w:w="2381"/>
+            <w:shd w:val="clear" w:color="auto" w:fill="F1F3F8"/>
+          </w:tcPr>
+          <w:p>
+            <w:pPr>
+              <w:spacing w:after="0"/>
+            </w:pPr>
+            <w:r>
+              <w:rPr>
+                <w:rFonts w:ascii="Consolas" w:hAnsi="Consolas"/>
+                <w:b w:val="0"/>
+                <w:color w:val="233C7D"/>
+                <w:sz w:val="19"/>
+              </w:rPr>
+              <w:t>user.role</w:t>
             </w:r>
           </w:p>
         </w:tc>
@@ -973,7 +1143,7 @@
                 <w:b w:val="0"/>
                 <w:sz w:val="19"/>
               </w:rPr>
-              <w:t>Email dell'utente (l'header mostra la sua iniziale).</w:t>
+              <w:t>Ruolo dell'utente (es. manager).</w:t>
             </w:r>
           </w:p>
         </w:tc>
@@ -997,7 +1167,7 @@
                 <w:color w:val="233C7D"/>
                 <w:sz w:val="19"/>
               </w:rPr>
-              <w:t>user.idProperty</w:t>
+              <w:t>user.propertyId</w:t>
             </w:r>
           </w:p>
         </w:tc>
@@ -1033,7 +1203,7 @@
                 <w:b w:val="0"/>
                 <w:sz w:val="19"/>
               </w:rPr>
-              <w:t>Stabilimento gestito (public id di catalog.properties).</w:t>
+              <w:t>Stabilimento gestito (public id di catalog.properties): il frontend lo manda come idProperty nelle altre API.</w:t>
             </w:r>
           </w:p>
         </w:tc>
@@ -1058,7 +1228,7 @@
                 <w:color w:val="233C7D"/>
                 <w:sz w:val="19"/>
               </w:rPr>
-              <w:t>user.roles</w:t>
+              <w:t>Set-Cookie: Nome</w:t>
             </w:r>
           </w:p>
         </w:tc>
@@ -1078,7 +1248,7 @@
                 <w:color w:val="233C7D"/>
                 <w:sz w:val="19"/>
               </w:rPr>
-              <w:t>string[] (array di stringhe)</w:t>
+              <w:t>sb_rt in sviluppo, __Secure-sb_rt in produzione</w:t>
             </w:r>
           </w:p>
         </w:tc>
@@ -1096,7 +1266,7 @@
                 <w:b w:val="0"/>
                 <w:sz w:val="19"/>
               </w:rPr>
-              <w:t>Ruoli dell'utente (es. Manager).</w:t>
+              <w:t>Il nome lo sceglie il backend (Auth:RefreshCookie).</w:t>
             </w:r>
           </w:p>
         </w:tc>
@@ -1120,7 +1290,7 @@
                 <w:color w:val="233C7D"/>
                 <w:sz w:val="19"/>
               </w:rPr>
-              <w:t>user.isElectronicReceiptAccepted</w:t>
+              <w:t>Set-Cookie: Valore</w:t>
             </w:r>
           </w:p>
         </w:tc>
@@ -1139,7 +1309,7 @@
                 <w:color w:val="233C7D"/>
                 <w:sz w:val="19"/>
               </w:rPr>
-              <w:t>boolean</w:t>
+              <w:t>string opaca</w:t>
             </w:r>
           </w:p>
         </w:tc>
@@ -1156,7 +1326,7 @@
                 <w:b w:val="0"/>
                 <w:sz w:val="19"/>
               </w:rPr>
-              <w:t>true se i termini e condizioni dello scontrino elettronico (pagina Fiscalizzazione) sono già stati accettati, false altrimenti. Con true la pagina mostra subito il form Configurazione account invece dei termini.</w:t>
+              <w:t>Il refresh token: il frontend non lo legge mai. Ogni nuovo cookie invalida il precedente (rotazione).</w:t>
             </w:r>
           </w:p>
         </w:tc>
@@ -1181,7 +1351,7 @@
                 <w:color w:val="233C7D"/>
                 <w:sz w:val="19"/>
               </w:rPr>
-              <w:t>Set-Cookie: Valore</w:t>
+              <w:t>Set-Cookie: HttpOnly; Secure; SameSite=Strict</w:t>
             </w:r>
           </w:p>
         </w:tc>
@@ -1201,7 +1371,7 @@
                 <w:color w:val="233C7D"/>
                 <w:sz w:val="19"/>
               </w:rPr>
-              <w:t>string opaca</w:t>
+              <w:t>attributi</w:t>
             </w:r>
           </w:p>
         </w:tc>
@@ -1219,7 +1389,7 @@
                 <w:b w:val="0"/>
                 <w:sz w:val="19"/>
               </w:rPr>
-              <w:t>Il refresh token: il frontend non lo legge mai. Ogni nuovo cookie invalida il precedente (rotazione).</w:t>
+              <w:t>Nessuno script può leggerlo e viaggia solo verso il nostro sito; Secure in produzione (in sviluppo il backend lo toglie, perché gira in http).</w:t>
             </w:r>
           </w:p>
         </w:tc>
@@ -1243,7 +1413,7 @@
                 <w:color w:val="233C7D"/>
                 <w:sz w:val="19"/>
               </w:rPr>
-              <w:t>Set-Cookie: HttpOnly; Secure; SameSite=Strict</w:t>
+              <w:t>Set-Cookie: Path</w:t>
             </w:r>
           </w:p>
         </w:tc>
@@ -1262,7 +1432,7 @@
                 <w:color w:val="233C7D"/>
                 <w:sz w:val="19"/>
               </w:rPr>
-              <w:t>attributi obbligatori</w:t>
+              <w:t>/api/identity</w:t>
             </w:r>
           </w:p>
         </w:tc>
@@ -1279,7 +1449,7 @@
                 <w:b w:val="0"/>
                 <w:sz w:val="19"/>
               </w:rPr>
-              <w:t>Nessuno script può leggerlo, viaggia solo in HTTPS e solo verso il nostro sito.</w:t>
+              <w:t>Così il browser lo invia solo alle API di identità (login, refresh, logout).</w:t>
             </w:r>
           </w:p>
         </w:tc>
@@ -1304,7 +1474,7 @@
                 <w:color w:val="233C7D"/>
                 <w:sz w:val="19"/>
               </w:rPr>
-              <w:t>Set-Cookie: Path</w:t>
+              <w:t>Set-Cookie: Max-Age</w:t>
             </w:r>
           </w:p>
         </w:tc>
@@ -1324,7 +1494,7 @@
                 <w:color w:val="233C7D"/>
                 <w:sz w:val="19"/>
               </w:rPr>
-              <w:t>/api/auth (consigliato)</w:t>
+              <w:t>number (secondi) | assente</w:t>
             </w:r>
           </w:p>
         </w:tc>
@@ -1342,67 +1512,7 @@
                 <w:b w:val="0"/>
                 <w:sz w:val="19"/>
               </w:rPr>
-              <w:t>Così il browser lo invia solo alle API di autenticazione. Il nome del cookie lo sceglie il backend.</w:t>
-            </w:r>
-          </w:p>
-        </w:tc>
-      </w:tr>
-      <w:tr>
-        <w:trPr>
-          <w:cantSplit w:val="true"/>
-        </w:trPr>
-        <w:tc>
-          <w:tcPr>
-            <w:tcW w:type="dxa" w:w="2381"/>
-          </w:tcPr>
-          <w:p>
-            <w:pPr>
-              <w:spacing w:after="0"/>
-            </w:pPr>
-            <w:r>
-              <w:rPr>
-                <w:rFonts w:ascii="Consolas" w:hAnsi="Consolas"/>
-                <w:b w:val="0"/>
-                <w:color w:val="233C7D"/>
-                <w:sz w:val="19"/>
-              </w:rPr>
-              <w:t>Set-Cookie: Max-Age</w:t>
-            </w:r>
-          </w:p>
-        </w:tc>
-        <w:tc>
-          <w:tcPr>
-            <w:tcW w:type="dxa" w:w="2608"/>
-          </w:tcPr>
-          <w:p>
-            <w:pPr>
-              <w:spacing w:after="0"/>
-            </w:pPr>
-            <w:r>
-              <w:rPr>
-                <w:rFonts w:ascii="Consolas" w:hAnsi="Consolas"/>
-                <w:b w:val="0"/>
-                <w:color w:val="233C7D"/>
-                <w:sz w:val="19"/>
-              </w:rPr>
-              <w:t>number (secondi) | assente</w:t>
-            </w:r>
-          </w:p>
-        </w:tc>
-        <w:tc>
-          <w:tcPr>
-            <w:tcW w:type="dxa" w:w="4876"/>
-          </w:tcPr>
-          <w:p>
-            <w:pPr>
-              <w:spacing w:after="0"/>
-            </w:pPr>
-            <w:r>
-              <w:rPr>
-                <w:b w:val="0"/>
-                <w:sz w:val="19"/>
-              </w:rPr>
-              <w:t>Con remember true cookie persistente; con remember false cookie di sessione (senza Max-Age né Expires), che si chiude col browser. Le durate le decide il backend (nei mock: access token 15 minuti, refresh token 30 giorni, 90 con remember).</w:t>
+              <w:t>Con remember true cookie persistente; con remember false cookie di sessione (senza Max-Age né Expires), che si chiude col browser. Durate del backend: access token 7 giorni, refresh token 30 giorni, 90 con remember.</w:t>
             </w:r>
           </w:p>
         </w:tc>
@@ -1587,7 +1697,7 @@
                 <w:color w:val="233C7D"/>
                 <w:sz w:val="19"/>
               </w:rPr>
-              <w:t>500</w:t>
+              <w:t>403</w:t>
             </w:r>
           </w:p>
         </w:tc>
@@ -1607,6 +1717,190 @@
                 <w:color w:val="233C7D"/>
                 <w:sz w:val="19"/>
               </w:rPr>
+              <w:t>auth.app_not_allowed</w:t>
+            </w:r>
+          </w:p>
+        </w:tc>
+        <w:tc>
+          <w:tcPr>
+            <w:tcW w:type="dxa" w:w="5896"/>
+            <w:shd w:val="clear" w:color="auto" w:fill="F1F3F8"/>
+          </w:tcPr>
+          <w:p>
+            <w:pPr>
+              <w:spacing w:after="0"/>
+            </w:pPr>
+            <w:r>
+              <w:rPr>
+                <w:b w:val="0"/>
+                <w:sz w:val="19"/>
+              </w:rPr>
+              <w:t>Il ruolo dell'utente non può accedere all'applicazione indicata in app (es. un systemadmin su "hub").</w:t>
+            </w:r>
+          </w:p>
+        </w:tc>
+      </w:tr>
+      <w:tr>
+        <w:trPr>
+          <w:cantSplit w:val="true"/>
+        </w:trPr>
+        <w:tc>
+          <w:tcPr>
+            <w:tcW w:type="dxa" w:w="907"/>
+          </w:tcPr>
+          <w:p>
+            <w:pPr>
+              <w:spacing w:after="0"/>
+            </w:pPr>
+            <w:r>
+              <w:rPr>
+                <w:rFonts w:ascii="Consolas" w:hAnsi="Consolas"/>
+                <w:b w:val="0"/>
+                <w:color w:val="233C7D"/>
+                <w:sz w:val="19"/>
+              </w:rPr>
+              <w:t>429</w:t>
+            </w:r>
+          </w:p>
+        </w:tc>
+        <w:tc>
+          <w:tcPr>
+            <w:tcW w:type="dxa" w:w="3061"/>
+          </w:tcPr>
+          <w:p>
+            <w:pPr>
+              <w:spacing w:after="0"/>
+            </w:pPr>
+            <w:r>
+              <w:rPr>
+                <w:rFonts w:ascii="Consolas" w:hAnsi="Consolas"/>
+                <w:b w:val="0"/>
+                <w:color w:val="233C7D"/>
+                <w:sz w:val="19"/>
+              </w:rPr>
+              <w:t>auth.too_many_attempts</w:t>
+            </w:r>
+          </w:p>
+        </w:tc>
+        <w:tc>
+          <w:tcPr>
+            <w:tcW w:type="dxa" w:w="5896"/>
+          </w:tcPr>
+          <w:p>
+            <w:pPr>
+              <w:spacing w:after="0"/>
+            </w:pPr>
+            <w:r>
+              <w:rPr>
+                <w:b w:val="0"/>
+                <w:sz w:val="19"/>
+              </w:rPr>
+              <w:t>Troppi tentativi di accesso dallo stesso indirizzo: il backend ne accetta 20 al minuto.</w:t>
+            </w:r>
+          </w:p>
+        </w:tc>
+      </w:tr>
+      <w:tr>
+        <w:trPr>
+          <w:cantSplit w:val="true"/>
+        </w:trPr>
+        <w:tc>
+          <w:tcPr>
+            <w:tcW w:type="dxa" w:w="907"/>
+            <w:shd w:val="clear" w:color="auto" w:fill="F1F3F8"/>
+          </w:tcPr>
+          <w:p>
+            <w:pPr>
+              <w:spacing w:after="0"/>
+            </w:pPr>
+            <w:r>
+              <w:rPr>
+                <w:rFonts w:ascii="Consolas" w:hAnsi="Consolas"/>
+                <w:b w:val="0"/>
+                <w:color w:val="233C7D"/>
+                <w:sz w:val="19"/>
+              </w:rPr>
+              <w:t>400</w:t>
+            </w:r>
+          </w:p>
+        </w:tc>
+        <w:tc>
+          <w:tcPr>
+            <w:tcW w:type="dxa" w:w="3061"/>
+            <w:shd w:val="clear" w:color="auto" w:fill="F1F3F8"/>
+          </w:tcPr>
+          <w:p>
+            <w:pPr>
+              <w:spacing w:after="0"/>
+            </w:pPr>
+            <w:r>
+              <w:rPr>
+                <w:rFonts w:ascii="Consolas" w:hAnsi="Consolas"/>
+                <w:b w:val="0"/>
+                <w:color w:val="233C7D"/>
+                <w:sz w:val="19"/>
+              </w:rPr>
+              <w:t>validation.failed</w:t>
+            </w:r>
+          </w:p>
+        </w:tc>
+        <w:tc>
+          <w:tcPr>
+            <w:tcW w:type="dxa" w:w="5896"/>
+            <w:shd w:val="clear" w:color="auto" w:fill="F1F3F8"/>
+          </w:tcPr>
+          <w:p>
+            <w:pPr>
+              <w:spacing w:after="0"/>
+            </w:pPr>
+            <w:r>
+              <w:rPr>
+                <w:b w:val="0"/>
+                <w:sz w:val="19"/>
+              </w:rPr>
+              <w:t>Corpo non valido (es. username o password mancanti, app sconosciuta); il dettaglio per campo è in errors[].</w:t>
+            </w:r>
+          </w:p>
+        </w:tc>
+      </w:tr>
+      <w:tr>
+        <w:trPr>
+          <w:cantSplit w:val="true"/>
+        </w:trPr>
+        <w:tc>
+          <w:tcPr>
+            <w:tcW w:type="dxa" w:w="907"/>
+          </w:tcPr>
+          <w:p>
+            <w:pPr>
+              <w:spacing w:after="0"/>
+            </w:pPr>
+            <w:r>
+              <w:rPr>
+                <w:rFonts w:ascii="Consolas" w:hAnsi="Consolas"/>
+                <w:b w:val="0"/>
+                <w:color w:val="233C7D"/>
+                <w:sz w:val="19"/>
+              </w:rPr>
+              <w:t>500</w:t>
+            </w:r>
+          </w:p>
+        </w:tc>
+        <w:tc>
+          <w:tcPr>
+            <w:tcW w:type="dxa" w:w="3061"/>
+          </w:tcPr>
+          <w:p>
+            <w:pPr>
+              <w:spacing w:after="0"/>
+            </w:pPr>
+            <w:r>
+              <w:rPr>
+                <w:rFonts w:ascii="Consolas" w:hAnsi="Consolas"/>
+                <w:b w:val="0"/>
+                <w:color w:val="233C7D"/>
+                <w:sz w:val="19"/>
+              </w:rPr>
               <w:t>server.unexpected</w:t>
             </w:r>
           </w:p>
@@ -1614,7 +1908,6 @@
         <w:tc>
           <w:tcPr>
             <w:tcW w:type="dxa" w:w="5896"/>
-            <w:shd w:val="clear" w:color="auto" w:fill="F1F3F8"/>
           </w:tcPr>
           <w:p>
             <w:pPr>
@@ -1662,7 +1955,7 @@
           <w:b w:val="0"/>
           <w:color w:val="233C7D"/>
         </w:rPr>
-        <w:t>/api/auth/refresh</w:t>
+        <w:t>/api/identity/auth/refresh</w:t>
       </w:r>
     </w:p>
     <w:p>
@@ -1910,7 +2203,7 @@
           <w:color w:val="233C7D"/>
           <w:sz w:val="19"/>
         </w:rPr>
-        <w:t xml:space="preserve">  "expiresIn": 900,</w:t>
+        <w:t xml:space="preserve">  "expiresIn": 604800,</w:t>
       </w:r>
     </w:p>
     <w:p>
@@ -1942,6 +2235,22 @@
           <w:color w:val="233C7D"/>
           <w:sz w:val="19"/>
         </w:rPr>
+        <w:t xml:space="preserve">    "id": "0f3c2a1b-7d6e-4f5a-9b8c-1d2e3f4a5b6c",</w:t>
+      </w:r>
+    </w:p>
+    <w:p>
+      <w:pPr>
+        <w:keepNext/>
+        <w:spacing w:after="0"/>
+        <w:shd w:val="clear" w:color="auto" w:fill="F1F3F8"/>
+      </w:pPr>
+      <w:r>
+        <w:rPr>
+          <w:rFonts w:ascii="Consolas" w:hAnsi="Consolas"/>
+          <w:b w:val="0"/>
+          <w:color w:val="233C7D"/>
+          <w:sz w:val="19"/>
+        </w:rPr>
         <w:t xml:space="preserve">    "email": "mario.rossi@example.com",</w:t>
       </w:r>
     </w:p>
@@ -1958,7 +2267,7 @@
           <w:color w:val="233C7D"/>
           <w:sz w:val="19"/>
         </w:rPr>
-        <w:t xml:space="preserve">    "idProperty": "5b1f3c7e-2d4a-4e8b-9c1d-7a6e5f4b3c2d",</w:t>
+        <w:t xml:space="preserve">    "role": "manager",</w:t>
       </w:r>
     </w:p>
     <w:p>
@@ -1974,55 +2283,7 @@
           <w:color w:val="233C7D"/>
           <w:sz w:val="19"/>
         </w:rPr>
-        <w:t xml:space="preserve">    "roles": [</w:t>
-      </w:r>
-    </w:p>
-    <w:p>
-      <w:pPr>
-        <w:keepNext/>
-        <w:spacing w:after="0"/>
-        <w:shd w:val="clear" w:color="auto" w:fill="F1F3F8"/>
-      </w:pPr>
-      <w:r>
-        <w:rPr>
-          <w:rFonts w:ascii="Consolas" w:hAnsi="Consolas"/>
-          <w:b w:val="0"/>
-          <w:color w:val="233C7D"/>
-          <w:sz w:val="19"/>
-        </w:rPr>
-        <w:t xml:space="preserve">      "Manager"</w:t>
-      </w:r>
-    </w:p>
-    <w:p>
-      <w:pPr>
-        <w:keepNext/>
-        <w:spacing w:after="0"/>
-        <w:shd w:val="clear" w:color="auto" w:fill="F1F3F8"/>
-      </w:pPr>
-      <w:r>
-        <w:rPr>
-          <w:rFonts w:ascii="Consolas" w:hAnsi="Consolas"/>
-          <w:b w:val="0"/>
-          <w:color w:val="233C7D"/>
-          <w:sz w:val="19"/>
-        </w:rPr>
-        <w:t xml:space="preserve">    ],</w:t>
-      </w:r>
-    </w:p>
-    <w:p>
-      <w:pPr>
-        <w:keepNext/>
-        <w:spacing w:after="0"/>
-        <w:shd w:val="clear" w:color="auto" w:fill="F1F3F8"/>
-      </w:pPr>
-      <w:r>
-        <w:rPr>
-          <w:rFonts w:ascii="Consolas" w:hAnsi="Consolas"/>
-          <w:b w:val="0"/>
-          <w:color w:val="233C7D"/>
-          <w:sz w:val="19"/>
-        </w:rPr>
-        <w:t xml:space="preserve">    "isElectronicReceiptAccepted": false</w:t>
+        <w:t xml:space="preserve">    "propertyId": "5b1f3c7e-2d4a-4e8b-9c1d-7a6e5f4b3c2d"</w:t>
       </w:r>
     </w:p>
     <w:p>
@@ -2354,7 +2615,130 @@
                 <w:color w:val="233C7D"/>
                 <w:sz w:val="19"/>
               </w:rPr>
+              <w:t>user.id</w:t>
+            </w:r>
+          </w:p>
+        </w:tc>
+        <w:tc>
+          <w:tcPr>
+            <w:tcW w:type="dxa" w:w="2608"/>
+            <w:shd w:val="clear" w:color="auto" w:fill="F1F3F8"/>
+          </w:tcPr>
+          <w:p>
+            <w:pPr>
+              <w:spacing w:after="0"/>
+            </w:pPr>
+            <w:r>
+              <w:rPr>
+                <w:rFonts w:ascii="Consolas" w:hAnsi="Consolas"/>
+                <w:b w:val="0"/>
+                <w:color w:val="233C7D"/>
+                <w:sz w:val="19"/>
+              </w:rPr>
+              <w:t>string (UUID)</w:t>
+            </w:r>
+          </w:p>
+        </w:tc>
+        <w:tc>
+          <w:tcPr>
+            <w:tcW w:type="dxa" w:w="4876"/>
+            <w:shd w:val="clear" w:color="auto" w:fill="F1F3F8"/>
+          </w:tcPr>
+          <w:p>
+            <w:pPr>
+              <w:spacing w:after="0"/>
+            </w:pPr>
+            <w:r>
+              <w:rPr>
+                <w:b w:val="0"/>
+                <w:sz w:val="19"/>
+              </w:rPr>
+              <w:t>Id dell'utente.</w:t>
+            </w:r>
+          </w:p>
+        </w:tc>
+      </w:tr>
+      <w:tr>
+        <w:trPr>
+          <w:cantSplit w:val="true"/>
+        </w:trPr>
+        <w:tc>
+          <w:tcPr>
+            <w:tcW w:type="dxa" w:w="2381"/>
+          </w:tcPr>
+          <w:p>
+            <w:pPr>
+              <w:spacing w:after="0"/>
+            </w:pPr>
+            <w:r>
+              <w:rPr>
+                <w:rFonts w:ascii="Consolas" w:hAnsi="Consolas"/>
+                <w:b w:val="0"/>
+                <w:color w:val="233C7D"/>
+                <w:sz w:val="19"/>
+              </w:rPr>
               <w:t>user.email</w:t>
+            </w:r>
+          </w:p>
+        </w:tc>
+        <w:tc>
+          <w:tcPr>
+            <w:tcW w:type="dxa" w:w="2608"/>
+          </w:tcPr>
+          <w:p>
+            <w:pPr>
+              <w:spacing w:after="0"/>
+            </w:pPr>
+            <w:r>
+              <w:rPr>
+                <w:rFonts w:ascii="Consolas" w:hAnsi="Consolas"/>
+                <w:b w:val="0"/>
+                <w:color w:val="233C7D"/>
+                <w:sz w:val="19"/>
+              </w:rPr>
+              <w:t>string</w:t>
+            </w:r>
+          </w:p>
+        </w:tc>
+        <w:tc>
+          <w:tcPr>
+            <w:tcW w:type="dxa" w:w="4876"/>
+          </w:tcPr>
+          <w:p>
+            <w:pPr>
+              <w:spacing w:after="0"/>
+            </w:pPr>
+            <w:r>
+              <w:rPr>
+                <w:b w:val="0"/>
+                <w:sz w:val="19"/>
+              </w:rPr>
+              <w:t>Email dell'utente (l'header mostra la sua iniziale).</w:t>
+            </w:r>
+          </w:p>
+        </w:tc>
+      </w:tr>
+      <w:tr>
+        <w:trPr>
+          <w:cantSplit w:val="true"/>
+        </w:trPr>
+        <w:tc>
+          <w:tcPr>
+            <w:tcW w:type="dxa" w:w="2381"/>
+            <w:shd w:val="clear" w:color="auto" w:fill="F1F3F8"/>
+          </w:tcPr>
+          <w:p>
+            <w:pPr>
+              <w:spacing w:after="0"/>
+            </w:pPr>
+            <w:r>
+              <w:rPr>
+                <w:rFonts w:ascii="Consolas" w:hAnsi="Consolas"/>
+                <w:b w:val="0"/>
+                <w:color w:val="233C7D"/>
+                <w:sz w:val="19"/>
+              </w:rPr>
+              <w:t>user.role</w:t>
             </w:r>
           </w:p>
         </w:tc>
@@ -2392,7 +2776,7 @@
                 <w:b w:val="0"/>
                 <w:sz w:val="19"/>
               </w:rPr>
-              <w:t>Email dell'utente (l'header mostra la sua iniziale).</w:t>
+              <w:t>Ruolo dell'utente (es. manager).</w:t>
             </w:r>
           </w:p>
         </w:tc>
@@ -2416,7 +2800,7 @@
                 <w:color w:val="233C7D"/>
                 <w:sz w:val="19"/>
               </w:rPr>
-              <w:t>user.idProperty</w:t>
+              <w:t>user.propertyId</w:t>
             </w:r>
           </w:p>
         </w:tc>
@@ -2452,7 +2836,7 @@
                 <w:b w:val="0"/>
                 <w:sz w:val="19"/>
               </w:rPr>
-              <w:t>Stabilimento gestito (public id di catalog.properties).</w:t>
+              <w:t>Stabilimento gestito (public id di catalog.properties): il frontend lo manda come idProperty nelle altre API.</w:t>
             </w:r>
           </w:p>
         </w:tc>
@@ -2477,7 +2861,7 @@
                 <w:color w:val="233C7D"/>
                 <w:sz w:val="19"/>
               </w:rPr>
-              <w:t>user.roles</w:t>
+              <w:t>Set-Cookie: Nome</w:t>
             </w:r>
           </w:p>
         </w:tc>
@@ -2497,7 +2881,7 @@
                 <w:color w:val="233C7D"/>
                 <w:sz w:val="19"/>
               </w:rPr>
-              <w:t>string[] (array di stringhe)</w:t>
+              <w:t>sb_rt in sviluppo, __Secure-sb_rt in produzione</w:t>
             </w:r>
           </w:p>
         </w:tc>
@@ -2515,7 +2899,7 @@
                 <w:b w:val="0"/>
                 <w:sz w:val="19"/>
               </w:rPr>
-              <w:t>Ruoli dell'utente (es. Manager).</w:t>
+              <w:t>Il nome lo sceglie il backend (Auth:RefreshCookie).</w:t>
             </w:r>
           </w:p>
         </w:tc>
@@ -2539,7 +2923,7 @@
                 <w:color w:val="233C7D"/>
                 <w:sz w:val="19"/>
               </w:rPr>
-              <w:t>user.isElectronicReceiptAccepted</w:t>
+              <w:t>Set-Cookie: Valore</w:t>
             </w:r>
           </w:p>
         </w:tc>
@@ -2558,7 +2942,7 @@
                 <w:color w:val="233C7D"/>
                 <w:sz w:val="19"/>
               </w:rPr>
-              <w:t>boolean</w:t>
+              <w:t>string opaca</w:t>
             </w:r>
           </w:p>
         </w:tc>
@@ -2575,7 +2959,7 @@
                 <w:b w:val="0"/>
                 <w:sz w:val="19"/>
               </w:rPr>
-              <w:t>true se i termini e condizioni dello scontrino elettronico (pagina Fiscalizzazione) sono già stati accettati, false altrimenti. Con true la pagina mostra subito il form Configurazione account invece dei termini.</w:t>
+              <w:t>Il refresh token: il frontend non lo legge mai. Ogni nuovo cookie invalida il precedente (rotazione).</w:t>
             </w:r>
           </w:p>
         </w:tc>
@@ -2600,7 +2984,7 @@
                 <w:color w:val="233C7D"/>
                 <w:sz w:val="19"/>
               </w:rPr>
-              <w:t>Set-Cookie: Valore</w:t>
+              <w:t>Set-Cookie: HttpOnly; Secure; SameSite=Strict</w:t>
             </w:r>
           </w:p>
         </w:tc>
@@ -2620,7 +3004,7 @@
                 <w:color w:val="233C7D"/>
                 <w:sz w:val="19"/>
               </w:rPr>
-              <w:t>string opaca</w:t>
+              <w:t>attributi</w:t>
             </w:r>
           </w:p>
         </w:tc>
@@ -2638,7 +3022,7 @@
                 <w:b w:val="0"/>
                 <w:sz w:val="19"/>
               </w:rPr>
-              <w:t>Il refresh token: il frontend non lo legge mai. Ogni nuovo cookie invalida il precedente (rotazione).</w:t>
+              <w:t>Nessuno script può leggerlo e viaggia solo verso il nostro sito; Secure in produzione (in sviluppo il backend lo toglie, perché gira in http).</w:t>
             </w:r>
           </w:p>
         </w:tc>
@@ -2662,7 +3046,7 @@
                 <w:color w:val="233C7D"/>
                 <w:sz w:val="19"/>
               </w:rPr>
-              <w:t>Set-Cookie: HttpOnly; Secure; SameSite=Strict</w:t>
+              <w:t>Set-Cookie: Path</w:t>
             </w:r>
           </w:p>
         </w:tc>
@@ -2681,7 +3065,7 @@
                 <w:color w:val="233C7D"/>
                 <w:sz w:val="19"/>
               </w:rPr>
-              <w:t>attributi obbligatori</w:t>
+              <w:t>/api/identity</w:t>
             </w:r>
           </w:p>
         </w:tc>
@@ -2698,7 +3082,7 @@
                 <w:b w:val="0"/>
                 <w:sz w:val="19"/>
               </w:rPr>
-              <w:t>Nessuno script può leggerlo, viaggia solo in HTTPS e solo verso il nostro sito.</w:t>
+              <w:t>Così il browser lo invia solo alle API di identità (login, refresh, logout).</w:t>
             </w:r>
           </w:p>
         </w:tc>
@@ -2723,7 +3107,7 @@
                 <w:color w:val="233C7D"/>
                 <w:sz w:val="19"/>
               </w:rPr>
-              <w:t>Set-Cookie: Path</w:t>
+              <w:t>Set-Cookie: Max-Age</w:t>
             </w:r>
           </w:p>
         </w:tc>
@@ -2743,7 +3127,7 @@
                 <w:color w:val="233C7D"/>
                 <w:sz w:val="19"/>
               </w:rPr>
-              <w:t>/api/auth (consigliato)</w:t>
+              <w:t>number (secondi) | assente</w:t>
             </w:r>
           </w:p>
         </w:tc>
@@ -2761,67 +3145,7 @@
                 <w:b w:val="0"/>
                 <w:sz w:val="19"/>
               </w:rPr>
-              <w:t>Così il browser lo invia solo alle API di autenticazione. Il nome del cookie lo sceglie il backend.</w:t>
-            </w:r>
-          </w:p>
-        </w:tc>
-      </w:tr>
-      <w:tr>
-        <w:trPr>
-          <w:cantSplit w:val="true"/>
-        </w:trPr>
-        <w:tc>
-          <w:tcPr>
-            <w:tcW w:type="dxa" w:w="2381"/>
-          </w:tcPr>
-          <w:p>
-            <w:pPr>
-              <w:spacing w:after="0"/>
-            </w:pPr>
-            <w:r>
-              <w:rPr>
-                <w:rFonts w:ascii="Consolas" w:hAnsi="Consolas"/>
-                <w:b w:val="0"/>
-                <w:color w:val="233C7D"/>
-                <w:sz w:val="19"/>
-              </w:rPr>
-              <w:t>Set-Cookie: Max-Age</w:t>
-            </w:r>
-          </w:p>
-        </w:tc>
-        <w:tc>
-          <w:tcPr>
-            <w:tcW w:type="dxa" w:w="2608"/>
-          </w:tcPr>
-          <w:p>
-            <w:pPr>
-              <w:spacing w:after="0"/>
-            </w:pPr>
-            <w:r>
-              <w:rPr>
-                <w:rFonts w:ascii="Consolas" w:hAnsi="Consolas"/>
-                <w:b w:val="0"/>
-                <w:color w:val="233C7D"/>
-                <w:sz w:val="19"/>
-              </w:rPr>
-              <w:t>number (secondi) | assente</w:t>
-            </w:r>
-          </w:p>
-        </w:tc>
-        <w:tc>
-          <w:tcPr>
-            <w:tcW w:type="dxa" w:w="4876"/>
-          </w:tcPr>
-          <w:p>
-            <w:pPr>
-              <w:spacing w:after="0"/>
-            </w:pPr>
-            <w:r>
-              <w:rPr>
-                <w:b w:val="0"/>
-                <w:sz w:val="19"/>
-              </w:rPr>
-              <w:t>Con remember true cookie persistente; con remember false cookie di sessione (senza Max-Age né Expires), che si chiude col browser. Le durate le decide il backend (nei mock: access token 15 minuti, refresh token 30 giorni, 90 con remember).</w:t>
+              <w:t>Con remember true cookie persistente; con remember false cookie di sessione (senza Max-Age né Expires), che si chiude col browser. Durate del backend: access token 7 giorni, refresh token 30 giorni, 90 con remember.</w:t>
             </w:r>
           </w:p>
         </w:tc>
@@ -3081,7 +3405,7 @@
           <w:b w:val="0"/>
           <w:color w:val="233C7D"/>
         </w:rPr>
-        <w:t>/api/auth/logout</w:t>
+        <w:t>/api/identity/auth/logout</w:t>
       </w:r>
     </w:p>
     <w:p>

</xml_diff>